<commit_message>
added raport for lab 4
</commit_message>
<xml_diff>
--- a/Lab3 Sprawozdanie Franciszek Kalembkiewicz.docx
+++ b/Lab3 Sprawozdanie Franciszek Kalembkiewicz.docx
@@ -213,6 +213,7 @@
       </w:pPr>
       <w:r>
         <w:rPr>
+          <w:noProof/>
           <w:sz w:val="28"/>
           <w:szCs w:val="28"/>
         </w:rPr>
@@ -289,34 +290,50 @@
           <w:sz w:val="24"/>
           <w:szCs w:val="24"/>
         </w:rPr>
-        <w:t xml:space="preserve">w networkx </w:t>
-      </w:r>
+        <w:t xml:space="preserve">w </w:t>
+      </w:r>
+      <w:proofErr w:type="spellStart"/>
       <w:r>
         <w:rPr>
           <w:sz w:val="24"/>
           <w:szCs w:val="24"/>
         </w:rPr>
-        <w:t xml:space="preserve">do sprawdzenia własności sieci. Potem wyświetlam je w terminalu. </w:t>
-      </w:r>
+        <w:t>networkx</w:t>
+      </w:r>
+      <w:proofErr w:type="spellEnd"/>
       <w:r>
         <w:rPr>
           <w:sz w:val="24"/>
           <w:szCs w:val="24"/>
         </w:rPr>
-        <w:t xml:space="preserve">Dla niektórych wartości </w:t>
+        <w:t xml:space="preserve"> </w:t>
       </w:r>
       <w:r>
         <w:rPr>
           <w:sz w:val="24"/>
           <w:szCs w:val="24"/>
         </w:rPr>
-        <w:t xml:space="preserve">graf powinien być spójny dlatego tworze </w:t>
+        <w:t xml:space="preserve">do sprawdzenia własności sieci. Potem wyświetlam je w terminalu. </w:t>
       </w:r>
       <w:r>
         <w:rPr>
           <w:sz w:val="24"/>
           <w:szCs w:val="24"/>
         </w:rPr>
+        <w:t xml:space="preserve">Dla niektórych wartości </w:t>
+      </w:r>
+      <w:r>
+        <w:rPr>
+          <w:sz w:val="24"/>
+          <w:szCs w:val="24"/>
+        </w:rPr>
+        <w:t xml:space="preserve">graf powinien być spójny dlatego tworze </w:t>
+      </w:r>
+      <w:r>
+        <w:rPr>
+          <w:sz w:val="24"/>
+          <w:szCs w:val="24"/>
+        </w:rPr>
         <w:t>największy spójny podgraf i na nim działam.</w:t>
       </w:r>
     </w:p>
@@ -331,6 +348,7 @@
       </w:pPr>
       <w:r>
         <w:rPr>
+          <w:noProof/>
           <w:sz w:val="24"/>
           <w:szCs w:val="24"/>
         </w:rPr>
@@ -1649,6 +1667,47 @@
       <w14:ligatures w14:val="none"/>
     </w:rPr>
   </w:style>
+  <w:style w:type="paragraph" w:styleId="Tekstprzypisukocowego">
+    <w:name w:val="endnote text"/>
+    <w:basedOn w:val="Normalny"/>
+    <w:link w:val="TekstprzypisukocowegoZnak"/>
+    <w:uiPriority w:val="99"/>
+    <w:semiHidden/>
+    <w:unhideWhenUsed/>
+    <w:rsid w:val="0047493F"/>
+    <w:pPr>
+      <w:spacing w:after="0" w:line="240" w:lineRule="auto"/>
+    </w:pPr>
+    <w:rPr>
+      <w:sz w:val="20"/>
+      <w:szCs w:val="20"/>
+    </w:rPr>
+  </w:style>
+  <w:style w:type="character" w:customStyle="1" w:styleId="TekstprzypisukocowegoZnak">
+    <w:name w:val="Tekst przypisu końcowego Znak"/>
+    <w:basedOn w:val="Domylnaczcionkaakapitu"/>
+    <w:link w:val="Tekstprzypisukocowego"/>
+    <w:uiPriority w:val="99"/>
+    <w:semiHidden/>
+    <w:rsid w:val="0047493F"/>
+    <w:rPr>
+      <w:kern w:val="0"/>
+      <w:sz w:val="20"/>
+      <w:szCs w:val="20"/>
+      <w14:ligatures w14:val="none"/>
+    </w:rPr>
+  </w:style>
+  <w:style w:type="character" w:styleId="Odwoanieprzypisukocowego">
+    <w:name w:val="endnote reference"/>
+    <w:basedOn w:val="Domylnaczcionkaakapitu"/>
+    <w:uiPriority w:val="99"/>
+    <w:semiHidden/>
+    <w:unhideWhenUsed/>
+    <w:rsid w:val="0047493F"/>
+    <w:rPr>
+      <w:vertAlign w:val="superscript"/>
+    </w:rPr>
+  </w:style>
 </w:styles>
 </file>
 

</xml_diff>